<commit_message>
fix(vehicles): mileage log header — 8pt barcode, letterhead logo position, month and Hijri date in header
</commit_message>
<xml_diff>
--- a/backend/templates/GSSG-GS_300-005_Vehicle_Mileage_Log.docx
+++ b/backend/templates/GSSG-GS_300-005_Vehicle_Mileage_Log.docx
@@ -18,22 +18,6 @@
           <w:rtl w:val="1"/>
         </w:rPr>
         <w:t>سجل عداد المسافات والصيانة الشهري للمركبات</w:t>
-      </w:r>
-    </w:p>
-    <w:p>
-      <w:pPr>
-        <w:bidi w:val="1"/>
-        <w:spacing w:before="0" w:after="0" w:line="260" w:lineRule="atLeast"/>
-        <w:jc w:val="center"/>
-      </w:pPr>
-      <w:r>
-        <w:rPr>
-          <w:rFonts w:ascii="Arial" w:hAnsi="Arial" w:cs="Arial"/>
-          <w:sz w:val="22"/>
-          <w:szCs w:val="22"/>
-          <w:rtl w:val="1"/>
-        </w:rPr>
-        <w:t>الشهر الميلادي: ‎{{ month_label }}‎    |    بداية الشهر هجرياً: {{ month_hijri }}</w:t>
       </w:r>
     </w:p>
     <w:tbl>
@@ -1169,7 +1153,7 @@
       <w:headerReference w:type="first" r:id="rId9"/>
       <w:footerReference w:type="first" r:id="rId10"/>
       <w:pgSz w:w="16838" w:h="11906" w:orient="landscape"/>
-      <w:pgMar w:top="2400" w:right="900" w:bottom="1440" w:left="900" w:header="360" w:footer="84" w:gutter="0"/>
+      <w:pgMar w:top="2400" w:right="900" w:bottom="1440" w:left="1620" w:header="360" w:footer="84" w:gutter="0"/>
       <w:cols w:space="708"/>
       <w:titlePg/>
       <w:docGrid w:linePitch="360"/>
@@ -4239,6 +4223,14 @@
 <file path=word/header2.xml><?xml version="1.0" encoding="utf-8"?>
 <w:hdr xmlns:wpc="http://schemas.microsoft.com/office/word/2010/wordprocessingCanvas" xmlns:cx="http://schemas.microsoft.com/office/drawing/2014/chartex" xmlns:cx1="http://schemas.microsoft.com/office/drawing/2015/9/8/chartex" xmlns:cx2="http://schemas.microsoft.com/office/drawing/2015/10/21/chartex" xmlns:cx3="http://schemas.microsoft.com/office/drawing/2016/5/9/chartex" xmlns:cx4="http://schemas.microsoft.com/office/drawing/2016/5/10/chartex" xmlns:cx5="http://schemas.microsoft.com/office/drawing/2016/5/11/chartex" xmlns:cx6="http://schemas.microsoft.com/office/drawing/2016/5/12/chartex" xmlns:cx7="http://schemas.microsoft.com/office/drawing/2016/5/13/chartex" xmlns:cx8="http://schemas.microsoft.com/office/drawing/2016/5/14/chartex" xmlns:mc="http://schemas.openxmlformats.org/markup-compatibility/2006" xmlns:aink="http://schemas.microsoft.com/office/drawing/2016/ink" xmlns:am3d="http://schemas.microsoft.com/office/drawing/2017/model3d" xmlns:o="urn:schemas-microsoft-com:office:office" xmlns:oel="http://schemas.microsoft.com/office/2019/extlst" xmlns:r="http://schemas.openxmlformats.org/officeDocument/2006/relationships" xmlns:m="http://schemas.openxmlformats.org/officeDocument/2006/math" xmlns:v="urn:schemas-microsoft-com:vml" xmlns:wp14="http://schemas.microsoft.com/office/word/2010/wordprocessingDrawing" xmlns:wp="http://schemas.openxmlformats.org/drawingml/2006/wordprocessingDrawing" xmlns:w10="urn:schemas-microsoft-com:office:word" xmlns:w="http://schemas.openxmlformats.org/wordprocessingml/2006/main" xmlns:w14="http://schemas.microsoft.com/office/word/2010/wordml" xmlns:w15="http://schemas.microsoft.com/office/word/2012/wordml" xmlns:w16cex="http://schemas.microsoft.com/office/word/2018/wordml/cex" xmlns:w16cid="http://schemas.microsoft.com/office/word/2016/wordml/cid" xmlns:w16="http://schemas.microsoft.com/office/word/2018/wordml" xmlns:w16du="http://schemas.microsoft.com/office/word/2023/wordml/word16du" xmlns:w16sdtdh="http://schemas.microsoft.com/office/word/2020/wordml/sdtdatahash" xmlns:w16sdtfl="http://schemas.microsoft.com/office/word/2024/wordml/sdtformatlock" xmlns:w16se="http://schemas.microsoft.com/office/word/2015/wordml/symex" xmlns:wpg="http://schemas.microsoft.com/office/word/2010/wordprocessingGroup" xmlns:wpi="http://schemas.microsoft.com/office/word/2010/wordprocessingInk" xmlns:wne="http://schemas.microsoft.com/office/word/2006/wordml" xmlns:wps="http://schemas.microsoft.com/office/word/2010/wordprocessingShape" mc:Ignorable="w14 w15 w16se w16cid w16 w16cex w16sdtdh w16sdtfl w16du wp14">
   <w:p>
+    <w:pPr>
+      <w:pStyle w:val="Header"/>
+      <w:ind w:left="-270"/>
+      <w:rPr>
+        <w:rFonts w:ascii="Myanmar MN" w:hAnsi="Myanmar MN" w:cs="Myanmar MN"/>
+        <w:noProof/>
+      </w:rPr>
+    </w:pPr>
     <w:r>
       <mc:AlternateContent>
         <mc:Choice Requires="wps">
@@ -4300,7 +4292,7 @@
                         </w:p>
                         <w:p>
                           <w:pPr>
-                            <w:spacing w:before="0" w:after="0" w:line="240" w:lineRule="atLeast"/>
+                            <w:spacing w:before="0" w:after="0" w:line="300" w:lineRule="exact"/>
                             <w:bidi/>
                             <w:ind w:left="720"/>
                             <w:rPr>
@@ -4324,7 +4316,7 @@
                         </w:p>
                         <w:p>
                           <w:pPr>
-                            <w:spacing w:before="0" w:after="0" w:line="240" w:lineRule="atLeast"/>
+                            <w:spacing w:before="0" w:after="0" w:line="300" w:lineRule="exact"/>
                             <w:bidi/>
                             <w:ind w:left="720"/>
                             <w:rPr>
@@ -4343,12 +4335,36 @@
                               <w:rtl/>
                               <w:lang w:val="en-US" w:bidi="ar-AE"/>
                             </w:rPr>
-                            <w:t>التاريخ: ‎{{ date }}‎</w:t>
+                            <w:t>التاريخ: ‎{{ date }}‎ م  الموافق  {{ hijri_date }}</w:t>
                           </w:r>
                         </w:p>
                         <w:p>
                           <w:pPr>
-                            <w:spacing w:before="0" w:after="0" w:line="240" w:lineRule="atLeast"/>
+                            <w:spacing w:before="0" w:after="0" w:line="300" w:lineRule="exact"/>
+                            <w:bidi/>
+                            <w:ind w:left="720"/>
+                            <w:rPr>
+                              <w:rFonts w:ascii="Univers Next Arabic" w:hAnsi="Univers Next Arabic" w:cs="Univers Next Arabic"/>
+                              <w:sz w:val="20"/>
+                              <w:szCs w:val="20"/>
+                              <w:rtl/>
+                              <w:lang w:val="en-US" w:bidi="ar-AE"/>
+                            </w:rPr>
+                          </w:pPr>
+                          <w:r>
+                            <w:rPr>
+                              <w:rFonts w:ascii="Univers Next Arabic" w:hAnsi="Univers Next Arabic" w:cs="Univers Next Arabic"/>
+                              <w:sz w:val="20"/>
+                              <w:szCs w:val="20"/>
+                              <w:rtl/>
+                              <w:lang w:val="en-US" w:bidi="ar-AE"/>
+                            </w:rPr>
+                            <w:t>الشهر: ‎{{ month_label }}‎</w:t>
+                          </w:r>
+                        </w:p>
+                        <w:p>
+                          <w:pPr>
+                            <w:spacing w:before="0" w:after="0" w:line="300" w:lineRule="exact"/>
                             <w:bidi/>
                             <w:ind w:left="720"/>
                             <w:rPr>
@@ -4371,11 +4387,11 @@
                         </w:p>
                         <w:p>
                           <w:pPr>
-                            <w:spacing w:before="0" w:after="0" w:line="240" w:lineRule="atLeast"/>
+                            <w:spacing w:before="0" w:after="0" w:line="300" w:lineRule="atLeast"/>
                             <w:tabs>
                               <w:tab w:val="left" w:pos="6857"/>
                             </w:tabs>
-                            <w:ind w:left="720" w:right="720"/>
+                            <w:ind w:left="0" w:right="0"/>
                             <w:jc w:val="right"/>
                             <w:rPr>
                               <w:rFonts w:ascii="Libre Barcode 39" w:hAnsi="Libre Barcode 39"/>
@@ -4384,28 +4400,12 @@
                               <w:lang w:val="en-US"/>
                             </w:rPr>
                           </w:pPr>
-                        </w:p>
-                        <w:p>
-                          <w:pPr>
-                            <w:spacing w:before="0" w:after="0" w:line="240" w:lineRule="atLeast"/>
-                            <w:tabs>
-                              <w:tab w:val="left" w:pos="6857"/>
-                            </w:tabs>
-                            <w:ind w:left="0" w:right="0"/>
-                            <w:jc w:val="right"/>
-                            <w:rPr>
-                              <w:rFonts w:ascii="Libre Barcode 39" w:hAnsi="Libre Barcode 39"/>
-                              <w:sz w:val="56"/>
-                              <w:szCs w:val="56"/>
-                              <w:lang w:val="en-US"/>
-                            </w:rPr>
-                          </w:pPr>
                           <w:proofErr w:type="spellStart"/>
                           <w:r>
                             <w:rPr>
                               <w:rFonts w:ascii="Libre Barcode 39" w:hAnsi="Libre Barcode 39"/>
-                              <w:sz w:val="56"/>
-                              <w:szCs w:val="56"/>
+                              <w:sz w:val="16"/>
+                              <w:szCs w:val="16"/>
                               <w:lang w:val="en-US"/>
                             </w:rPr>
                             <w:t>{{ barcode }}</w:t>
@@ -4472,7 +4472,7 @@
                   </w:p>
                   <w:p>
                     <w:pPr>
-                      <w:spacing w:before="0" w:after="0" w:line="240" w:lineRule="atLeast"/>
+                      <w:spacing w:before="0" w:after="0" w:line="300" w:lineRule="exact"/>
                       <w:bidi/>
                       <w:ind w:left="720"/>
                       <w:rPr>
@@ -4496,7 +4496,7 @@
                   </w:p>
                   <w:p>
                     <w:pPr>
-                      <w:spacing w:before="0" w:after="0" w:line="240" w:lineRule="atLeast"/>
+                      <w:spacing w:before="0" w:after="0" w:line="300" w:lineRule="exact"/>
                       <w:bidi/>
                       <w:ind w:left="720"/>
                       <w:rPr>
@@ -4515,12 +4515,36 @@
                         <w:rtl/>
                         <w:lang w:val="en-US" w:bidi="ar-AE"/>
                       </w:rPr>
-                      <w:t>التاريخ: ‎{{ date }}‎</w:t>
+                      <w:t>التاريخ: ‎{{ date }}‎ م  الموافق  {{ hijri_date }}</w:t>
                     </w:r>
                   </w:p>
                   <w:p>
                     <w:pPr>
-                      <w:spacing w:before="0" w:after="0" w:line="240" w:lineRule="atLeast"/>
+                      <w:spacing w:before="0" w:after="0" w:line="300" w:lineRule="exact"/>
+                      <w:bidi/>
+                      <w:ind w:left="720"/>
+                      <w:rPr>
+                        <w:rFonts w:ascii="Univers Next Arabic" w:hAnsi="Univers Next Arabic" w:cs="Univers Next Arabic"/>
+                        <w:sz w:val="20"/>
+                        <w:szCs w:val="20"/>
+                        <w:rtl/>
+                        <w:lang w:val="en-US" w:bidi="ar-AE"/>
+                      </w:rPr>
+                    </w:pPr>
+                    <w:r>
+                      <w:rPr>
+                        <w:rFonts w:ascii="Univers Next Arabic" w:hAnsi="Univers Next Arabic" w:cs="Univers Next Arabic"/>
+                        <w:sz w:val="20"/>
+                        <w:szCs w:val="20"/>
+                        <w:rtl/>
+                        <w:lang w:val="en-US" w:bidi="ar-AE"/>
+                      </w:rPr>
+                      <w:t>الشهر: ‎{{ month_label }}‎</w:t>
+                    </w:r>
+                  </w:p>
+                  <w:p>
+                    <w:pPr>
+                      <w:spacing w:before="0" w:after="0" w:line="300" w:lineRule="exact"/>
                       <w:bidi/>
                       <w:ind w:left="720"/>
                       <w:rPr>
@@ -4543,11 +4567,11 @@
                   </w:p>
                   <w:p>
                     <w:pPr>
-                      <w:spacing w:before="0" w:after="0" w:line="240" w:lineRule="atLeast"/>
+                      <w:spacing w:before="0" w:after="0" w:line="300" w:lineRule="atLeast"/>
                       <w:tabs>
                         <w:tab w:val="left" w:pos="6857"/>
                       </w:tabs>
-                      <w:ind w:left="720" w:right="720"/>
+                      <w:ind w:left="0" w:right="0"/>
                       <w:jc w:val="right"/>
                       <w:rPr>
                         <w:rFonts w:ascii="Libre Barcode 39" w:hAnsi="Libre Barcode 39"/>
@@ -4556,28 +4580,12 @@
                         <w:lang w:val="en-US"/>
                       </w:rPr>
                     </w:pPr>
-                  </w:p>
-                  <w:p>
-                    <w:pPr>
-                      <w:spacing w:before="0" w:after="0" w:line="240" w:lineRule="atLeast"/>
-                      <w:tabs>
-                        <w:tab w:val="left" w:pos="6857"/>
-                      </w:tabs>
-                      <w:ind w:left="0" w:right="0"/>
-                      <w:jc w:val="right"/>
-                      <w:rPr>
-                        <w:rFonts w:ascii="Libre Barcode 39" w:hAnsi="Libre Barcode 39"/>
-                        <w:sz w:val="56"/>
-                        <w:szCs w:val="56"/>
-                        <w:lang w:val="en-US"/>
-                      </w:rPr>
-                    </w:pPr>
                     <w:proofErr w:type="spellStart"/>
                     <w:r>
                       <w:rPr>
                         <w:rFonts w:ascii="Libre Barcode 39" w:hAnsi="Libre Barcode 39"/>
-                        <w:sz w:val="56"/>
-                        <w:szCs w:val="56"/>
+                        <w:sz w:val="16"/>
+                        <w:szCs w:val="16"/>
                         <w:lang w:val="en-US"/>
                       </w:rPr>
                       <w:t>{{ barcode }}</w:t>
@@ -4607,16 +4615,6 @@
         </mc:Fallback>
       </mc:AlternateContent>
     </w:r>
-  </w:p>
-  <w:p>
-    <w:pPr>
-      <w:pStyle w:val="Header"/>
-      <w:ind w:left="-270"/>
-      <w:rPr>
-        <w:rFonts w:ascii="Myanmar MN" w:hAnsi="Myanmar MN" w:cs="Myanmar MN"/>
-        <w:noProof/>
-      </w:rPr>
-    </w:pPr>
   </w:p>
   <w:p>
     <w:pPr>

</xml_diff>

<commit_message>
fix(vehicles): mileage log shows the month name centred, larger logo, table spacing
</commit_message>
<xml_diff>
--- a/backend/templates/GSSG-GS_300-005_Vehicle_Mileage_Log.docx
+++ b/backend/templates/GSSG-GS_300-005_Vehicle_Mileage_Log.docx
@@ -18,6 +18,24 @@
           <w:rtl w:val="1"/>
         </w:rPr>
         <w:t>سجل عداد المسافات والصيانة الشهري للمركبات</w:t>
+      </w:r>
+    </w:p>
+    <w:p>
+      <w:pPr>
+        <w:bidi w:val="1"/>
+        <w:spacing w:before="0" w:after="280" w:line="260" w:lineRule="atLeast"/>
+        <w:jc w:val="center"/>
+      </w:pPr>
+      <w:r>
+        <w:rPr>
+          <w:rFonts w:ascii="Arial" w:hAnsi="Arial" w:cs="Arial"/>
+          <w:b/>
+          <w:bCs/>
+          <w:sz w:val="32"/>
+          <w:szCs w:val="32"/>
+          <w:rtl w:val="1"/>
+        </w:rPr>
+        <w:t>شهر {{ month_label }}</w:t>
       </w:r>
     </w:p>
     <w:tbl>
@@ -4347,30 +4365,6 @@
                               <w:rFonts w:ascii="Univers Next Arabic" w:hAnsi="Univers Next Arabic" w:cs="Univers Next Arabic"/>
                               <w:sz w:val="20"/>
                               <w:szCs w:val="20"/>
-                              <w:rtl/>
-                              <w:lang w:val="en-US" w:bidi="ar-AE"/>
-                            </w:rPr>
-                          </w:pPr>
-                          <w:r>
-                            <w:rPr>
-                              <w:rFonts w:ascii="Univers Next Arabic" w:hAnsi="Univers Next Arabic" w:cs="Univers Next Arabic"/>
-                              <w:sz w:val="20"/>
-                              <w:szCs w:val="20"/>
-                              <w:rtl/>
-                              <w:lang w:val="en-US" w:bidi="ar-AE"/>
-                            </w:rPr>
-                            <w:t>الشهر: ‎{{ month_label }}‎</w:t>
-                          </w:r>
-                        </w:p>
-                        <w:p>
-                          <w:pPr>
-                            <w:spacing w:before="0" w:after="0" w:line="300" w:lineRule="exact"/>
-                            <w:bidi/>
-                            <w:ind w:left="720"/>
-                            <w:rPr>
-                              <w:rFonts w:ascii="Univers Next Arabic" w:hAnsi="Univers Next Arabic" w:cs="Univers Next Arabic"/>
-                              <w:sz w:val="20"/>
-                              <w:szCs w:val="20"/>
                               <w:lang w:val="en-US" w:bidi="ar-AE"/>
                             </w:rPr>
                           </w:pPr>
@@ -4527,30 +4521,6 @@
                         <w:rFonts w:ascii="Univers Next Arabic" w:hAnsi="Univers Next Arabic" w:cs="Univers Next Arabic"/>
                         <w:sz w:val="20"/>
                         <w:szCs w:val="20"/>
-                        <w:rtl/>
-                        <w:lang w:val="en-US" w:bidi="ar-AE"/>
-                      </w:rPr>
-                    </w:pPr>
-                    <w:r>
-                      <w:rPr>
-                        <w:rFonts w:ascii="Univers Next Arabic" w:hAnsi="Univers Next Arabic" w:cs="Univers Next Arabic"/>
-                        <w:sz w:val="20"/>
-                        <w:szCs w:val="20"/>
-                        <w:rtl/>
-                        <w:lang w:val="en-US" w:bidi="ar-AE"/>
-                      </w:rPr>
-                      <w:t>الشهر: ‎{{ month_label }}‎</w:t>
-                    </w:r>
-                  </w:p>
-                  <w:p>
-                    <w:pPr>
-                      <w:spacing w:before="0" w:after="0" w:line="300" w:lineRule="exact"/>
-                      <w:bidi/>
-                      <w:ind w:left="720"/>
-                      <w:rPr>
-                        <w:rFonts w:ascii="Univers Next Arabic" w:hAnsi="Univers Next Arabic" w:cs="Univers Next Arabic"/>
-                        <w:sz w:val="20"/>
-                        <w:szCs w:val="20"/>
                         <w:lang w:val="en-US" w:bidi="ar-AE"/>
                       </w:rPr>
                     </w:pPr>
@@ -4618,6 +4588,7 @@
   </w:p>
   <w:p>
     <w:pPr>
+      <w:spacing w:before="0" w:after="0" w:line="100" w:lineRule="exact"/>
       <w:pStyle w:val="Header"/>
       <w:ind w:left="-270"/>
       <w:rPr>
@@ -4644,7 +4615,7 @@
         <mc:Choice Requires="wpg">
           <w:drawing>
             <wp:inline distT="0" distB="0" distL="0" distR="0" wp14:anchorId="0AEDF4CA" wp14:editId="6A683B9A">
-              <wp:extent cx="1795780" cy="296058"/>
+              <wp:extent cx="2334514" cy="384875"/>
               <wp:effectExtent l="0" t="0" r="0" b="8890"/>
               <wp:docPr id="1" name="Group 1"/>
               <wp:cNvGraphicFramePr>
@@ -4659,7 +4630,7 @@
                     <wpg:grpSpPr>
                       <a:xfrm>
                         <a:off x="0" y="0"/>
-                        <a:ext cx="1795780" cy="296058"/>
+                        <a:ext cx="2334514" cy="384875"/>
                         <a:chOff x="13916" y="44441"/>
                         <a:chExt cx="1795780" cy="296058"/>
                       </a:xfrm>
@@ -5133,7 +5104,7 @@
         </mc:Choice>
         <mc:Fallback>
           <w:pict>
-            <v:group w14:anchorId="713803DF" id="Group 1" o:spid="_x0000_s1026" style="width:141.4pt;height:23.3pt;mso-position-horizontal-relative:char;mso-position-vertical-relative:line" coordorigin="139,444" coordsize="17957,2960" o:gfxdata="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">
+            <v:group w14:anchorId="713803DF" id="Group 1" o:spid="_x0000_s1026" style="width:183.8pt;height:30.3pt;mso-position-horizontal-relative:char;mso-position-vertical-relative:line" coordorigin="139,444" coordsize="17957,2960" o:gfxdata="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">
               <v:shape id="Graphic 3" o:spid="_x0000_s1027" style="position:absolute;left:139;top:444;width:17957;height:1105;visibility:visible;mso-wrap-style:square;v-text-anchor:top" coordsize="1795780,110489" o:gfxdata="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" path="m1795767,l813473,,609819,944,451951,3778,387945,5904,332695,8502r-47390,3070l244878,15115r-63552,8503l134865,34010,98323,46291,39017,75742,,110032r11556,-1270l47636,105280r40532,-3258l133002,98997,240482,93449,383895,88506r7912,-191l1703969,88315,1795767,xe" fillcolor="#b92026" stroked="f">
                 <v:path arrowok="t"/>
               </v:shape>

</xml_diff>

<commit_message>
fix(vehicles): drop the Hijri date from the mileage log header
</commit_message>
<xml_diff>
--- a/backend/templates/GSSG-GS_300-005_Vehicle_Mileage_Log.docx
+++ b/backend/templates/GSSG-GS_300-005_Vehicle_Mileage_Log.docx
@@ -4353,7 +4353,7 @@
                               <w:rtl/>
                               <w:lang w:val="en-US" w:bidi="ar-AE"/>
                             </w:rPr>
-                            <w:t>التاريخ: ‎{{ date }}‎ م  الموافق  {{ hijri_date }}</w:t>
+                            <w:t>التاريخ: ‎{{ date }}‎</w:t>
                           </w:r>
                         </w:p>
                         <w:p>
@@ -4509,7 +4509,7 @@
                         <w:rtl/>
                         <w:lang w:val="en-US" w:bidi="ar-AE"/>
                       </w:rPr>
-                      <w:t>التاريخ: ‎{{ date }}‎ م  الموافق  {{ hijri_date }}</w:t>
+                      <w:t>التاريخ: ‎{{ date }}‎</w:t>
                     </w:r>
                   </w:p>
                   <w:p>

</xml_diff>